<commit_message>
Add detailed member contributions and screenshot placeholders to Word docx and PDF report
</commit_message>
<xml_diff>
--- a/Group_Chat_Architecture_Report.docx
+++ b/Group_Chat_Architecture_Report.docx
@@ -20,7 +20,7 @@
           <w:color w:val="4F46E5"/>
           <w:sz w:val="22"/>
         </w:rPr>
-        <w:t>Computer System Design (CSD) — Assignment 4 | Technical &amp; Deployment Report</w:t>
+        <w:t>Computer System Design (CSD) — Assignment 4 | Comprehensive Technical &amp; Team Contribution Report</w:t>
       </w:r>
     </w:p>
     <w:p/>
@@ -99,7 +99,7 @@
                 <w:b/>
                 <w:sz w:val="19"/>
               </w:rPr>
-              <w:t xml:space="preserve">Host Machine: </w:t>
+              <w:t xml:space="preserve">Host SSH Machine: </w:t>
             </w:r>
             <w:r>
               <w:rPr>
@@ -230,7 +230,7 @@
           <w:color w:val="1E1B4B"/>
           <w:sz w:val="26"/>
         </w:rPr>
-        <w:t>2. Group Members &amp; SSH Server Allotment</w:t>
+        <w:t>2. Team Members &amp; Individual Contributions</w:t>
       </w:r>
     </w:p>
     <w:tbl>
@@ -307,7 +307,7 @@
                 <w:color w:val="FFFFFF"/>
                 <w:sz w:val="18"/>
               </w:rPr>
-              <w:t>SSH Connection Command</w:t>
+              <w:t>SSH Machine Command</w:t>
             </w:r>
           </w:p>
         </w:tc>
@@ -323,7 +323,7 @@
                 <w:color w:val="FFFFFF"/>
                 <w:sz w:val="18"/>
               </w:rPr>
-              <w:t>Access URL</w:t>
+              <w:t>Key Technical Contribution</w:t>
             </w:r>
           </w:p>
         </w:tc>
@@ -391,7 +391,7 @@
               <w:rPr>
                 <w:sz w:val="17"/>
               </w:rPr>
-              <w:t>http://10.1.75.51:5237/</w:t>
+              <w:t>Backend System Architecture, Flask-SocketIO Core, AES-256-GCM &amp; Ed25519 Cryptographic Pipeline, SSH Server Deployment &amp; Daemon Management.</w:t>
             </w:r>
           </w:p>
         </w:tc>
@@ -459,7 +459,7 @@
               <w:rPr>
                 <w:sz w:val="17"/>
               </w:rPr>
-              <w:t>http://10.1.75.51:5237/</w:t>
+              <w:t>Front-End UI Design, Cyberpunk Aurora Glassmorphism Theme, Socket.IO Client Event Listeners, Dynamic Gradient Avatar Generator.</w:t>
             </w:r>
           </w:p>
         </w:tc>
@@ -527,7 +527,7 @@
               <w:rPr>
                 <w:sz w:val="17"/>
               </w:rPr>
-              <w:t>http://10.1.75.51:5237/</w:t>
+              <w:t>Database Schema Architecture (chat.db), SQLite Message Persistence Engine, Reconnection State Management &amp; History Pre-loading.</w:t>
             </w:r>
           </w:p>
         </w:tc>
@@ -595,12 +595,99 @@
               <w:rPr>
                 <w:sz w:val="17"/>
               </w:rPr>
-              <w:t>http://10.1.75.51:5237/</w:t>
+              <w:t>Multi-Client Integration &amp; Testing across SSH Machines (10.1.75.51:5237), Graceful Disconnection Handling, SQLite Inspection Scripts.</w:t>
             </w:r>
           </w:p>
         </w:tc>
       </w:tr>
     </w:tbl>
+    <w:p/>
+    <w:p>
+      <w:r>
+        <w:rPr>
+          <w:b/>
+          <w:color w:val="4F46E5"/>
+          <w:sz w:val="22"/>
+        </w:rPr>
+        <w:t>Detailed Task Breakdown:</w:t>
+      </w:r>
+    </w:p>
+    <w:p>
+      <w:pPr>
+        <w:pStyle w:val="ListBullet"/>
+        <w:spacing w:after="60"/>
+      </w:pPr>
+      <w:r>
+        <w:rPr>
+          <w:b/>
+          <w:sz w:val="18"/>
+        </w:rPr>
+        <w:t xml:space="preserve">Ranga Chandra Naga Venkata Chaitanya Kumar (12341740): </w:t>
+      </w:r>
+      <w:r>
+        <w:rPr>
+          <w:sz w:val="18"/>
+        </w:rPr>
+        <w:t>Designed the core Flask-SocketIO architecture, implemented server-side room management, integrated AES-256-GCM symmetric encryption and per-user Ed25519 digital signature signing/verification, and managed SSH server deployment on student@10.1.75.51:2237.</w:t>
+      </w:r>
+    </w:p>
+    <w:p>
+      <w:pPr>
+        <w:pStyle w:val="ListBullet"/>
+        <w:spacing w:after="60"/>
+      </w:pPr>
+      <w:r>
+        <w:rPr>
+          <w:b/>
+          <w:sz w:val="18"/>
+        </w:rPr>
+        <w:t xml:space="preserve">Bhukya Raju (12340520): </w:t>
+      </w:r>
+      <w:r>
+        <w:rPr>
+          <w:sz w:val="18"/>
+        </w:rPr>
+        <w:t>Developed the single-page responsive UI using HTML5, CSS3, and JavaScript, designed the Cyberpunk Aurora dark-mode glassmorphic theme with glowing ambient mesh blobs, and created dynamic user avatar color generators.</w:t>
+      </w:r>
+    </w:p>
+    <w:p>
+      <w:pPr>
+        <w:pStyle w:val="ListBullet"/>
+        <w:spacing w:after="60"/>
+      </w:pPr>
+      <w:r>
+        <w:rPr>
+          <w:b/>
+          <w:sz w:val="18"/>
+        </w:rPr>
+        <w:t xml:space="preserve">V.G.N. Harshitha (12342310): </w:t>
+      </w:r>
+      <w:r>
+        <w:rPr>
+          <w:sz w:val="18"/>
+        </w:rPr>
+        <w:t>Architected the SQLite database layer (chat.db) with tables for messages and user public keys, implemented message history pre-loading on user join, and ensured data integrity during server restarts.</w:t>
+      </w:r>
+    </w:p>
+    <w:p>
+      <w:pPr>
+        <w:pStyle w:val="ListBullet"/>
+        <w:spacing w:after="60"/>
+      </w:pPr>
+      <w:r>
+        <w:rPr>
+          <w:b/>
+          <w:sz w:val="18"/>
+        </w:rPr>
+        <w:t xml:space="preserve">Maloth Madhu (12341370): </w:t>
+      </w:r>
+      <w:r>
+        <w:rPr>
+          <w:sz w:val="18"/>
+        </w:rPr>
+        <w:t>Executed end-to-end integration testing across 4 lab client SSH machines, verified port forwarding (5000 -&gt; 5237), implemented edge-case socket disconnection handling, and documented SQLite database inspection queries.</w:t>
+      </w:r>
+    </w:p>
     <w:p/>
     <w:p>
       <w:r>
@@ -708,7 +795,7 @@
             <w:r>
               <w:rPr>
                 <w:b/>
-                <w:color w:val="16A34A"/>
+                <w:color w:val="16A3A4"/>
                 <w:sz w:val="17"/>
               </w:rPr>
               <w:t>VERIFIED</w:t>
@@ -751,7 +838,7 @@
             <w:r>
               <w:rPr>
                 <w:b/>
-                <w:color w:val="16A34A"/>
+                <w:color w:val="16A3A4"/>
                 <w:sz w:val="17"/>
               </w:rPr>
               <w:t>VERIFIED</w:t>
@@ -794,7 +881,7 @@
             <w:r>
               <w:rPr>
                 <w:b/>
-                <w:color w:val="16A34A"/>
+                <w:color w:val="16A3A4"/>
                 <w:sz w:val="17"/>
               </w:rPr>
               <w:t>VERIFIED</w:t>
@@ -837,7 +924,7 @@
             <w:r>
               <w:rPr>
                 <w:b/>
-                <w:color w:val="16A34A"/>
+                <w:color w:val="16A3A4"/>
                 <w:sz w:val="17"/>
               </w:rPr>
               <w:t>VERIFIED</w:t>
@@ -880,7 +967,7 @@
             <w:r>
               <w:rPr>
                 <w:b/>
-                <w:color w:val="16A34A"/>
+                <w:color w:val="16A3A4"/>
                 <w:sz w:val="17"/>
               </w:rPr>
               <w:t>VERIFIED</w:t>
@@ -923,7 +1010,7 @@
             <w:r>
               <w:rPr>
                 <w:b/>
-                <w:color w:val="16A34A"/>
+                <w:color w:val="16A3A4"/>
                 <w:sz w:val="17"/>
               </w:rPr>
               <w:t>VERIFIED</w:t>
@@ -966,7 +1053,7 @@
             <w:r>
               <w:rPr>
                 <w:b/>
-                <w:color w:val="16A34A"/>
+                <w:color w:val="16A3A4"/>
                 <w:sz w:val="17"/>
               </w:rPr>
               <w:t>VERIFIED</w:t>
@@ -1009,7 +1096,7 @@
             <w:r>
               <w:rPr>
                 <w:b/>
-                <w:color w:val="16A34A"/>
+                <w:color w:val="16A3A4"/>
                 <w:sz w:val="17"/>
               </w:rPr>
               <w:t>VERIFIED</w:t>
@@ -1026,7 +1113,202 @@
           <w:color w:val="1E1B4B"/>
           <w:sz w:val="26"/>
         </w:rPr>
-        <w:t>4. Database Verification Commands (SSH Host)</w:t>
+        <w:t>4. Application Screenshots &amp; Visual Proof</w:t>
+      </w:r>
+    </w:p>
+    <w:tbl>
+      <w:tblPr>
+        <w:tblW w:type="auto" w:w="0"/>
+        <w:jc w:val="center"/>
+        <w:tblLook w:firstColumn="1" w:firstRow="1" w:lastColumn="0" w:lastRow="0" w:noHBand="0" w:noVBand="1" w:val="04A0"/>
+      </w:tblPr>
+      <w:tblGrid>
+        <w:gridCol w:w="10512"/>
+      </w:tblGrid>
+      <w:tr>
+        <w:tc>
+          <w:tcPr>
+            <w:tcW w:type="dxa" w:w="10512"/>
+            <w:shd w:fill="F8FAFC"/>
+          </w:tcPr>
+          <w:p>
+            <w:pPr>
+              <w:spacing w:before="240" w:after="120"/>
+              <w:jc w:val="center"/>
+            </w:pPr>
+            <w:r>
+              <w:rPr>
+                <w:b/>
+                <w:color w:val="0284C7"/>
+                <w:sz w:val="19"/>
+              </w:rPr>
+              <w:t>📸 Screenshot 1: Real-Time Chat Interface on http://10.1.75.51:5237/ showing multi-user chat, dynamic avatars, and live typing indicator</w:t>
+              <w:br/>
+            </w:r>
+            <w:r>
+              <w:rPr>
+                <w:i/>
+                <w:color w:val="94A3B8"/>
+                <w:sz w:val="18"/>
+              </w:rPr>
+              <w:t>[ Paste Screenshot Here ]</w:t>
+            </w:r>
+          </w:p>
+        </w:tc>
+      </w:tr>
+    </w:tbl>
+    <w:p>
+      <w:pPr>
+        <w:spacing w:after="120"/>
+      </w:pPr>
+    </w:p>
+    <w:tbl>
+      <w:tblPr>
+        <w:tblW w:type="auto" w:w="0"/>
+        <w:jc w:val="center"/>
+        <w:tblLook w:firstColumn="1" w:firstRow="1" w:lastColumn="0" w:lastRow="0" w:noHBand="0" w:noVBand="1" w:val="04A0"/>
+      </w:tblPr>
+      <w:tblGrid>
+        <w:gridCol w:w="10512"/>
+      </w:tblGrid>
+      <w:tr>
+        <w:tc>
+          <w:tcPr>
+            <w:tcW w:type="dxa" w:w="10512"/>
+            <w:shd w:fill="F8FAFC"/>
+          </w:tcPr>
+          <w:p>
+            <w:pPr>
+              <w:spacing w:before="240" w:after="120"/>
+              <w:jc w:val="center"/>
+            </w:pPr>
+            <w:r>
+              <w:rPr>
+                <w:b/>
+                <w:color w:val="0284C7"/>
+                <w:sz w:val="19"/>
+              </w:rPr>
+              <w:t>📸 Screenshot 2: User Join Modal &amp; Unique Username Validation Screen</w:t>
+              <w:br/>
+            </w:r>
+            <w:r>
+              <w:rPr>
+                <w:i/>
+                <w:color w:val="94A3B8"/>
+                <w:sz w:val="18"/>
+              </w:rPr>
+              <w:t>[ Paste Screenshot Here ]</w:t>
+            </w:r>
+          </w:p>
+        </w:tc>
+      </w:tr>
+    </w:tbl>
+    <w:p>
+      <w:pPr>
+        <w:spacing w:after="120"/>
+      </w:pPr>
+    </w:p>
+    <w:tbl>
+      <w:tblPr>
+        <w:tblW w:type="auto" w:w="0"/>
+        <w:jc w:val="center"/>
+        <w:tblLook w:firstColumn="1" w:firstRow="1" w:lastColumn="0" w:lastRow="0" w:noHBand="0" w:noVBand="1" w:val="04A0"/>
+      </w:tblPr>
+      <w:tblGrid>
+        <w:gridCol w:w="10512"/>
+      </w:tblGrid>
+      <w:tr>
+        <w:tc>
+          <w:tcPr>
+            <w:tcW w:type="dxa" w:w="10512"/>
+            <w:shd w:fill="F8FAFC"/>
+          </w:tcPr>
+          <w:p>
+            <w:pPr>
+              <w:spacing w:before="240" w:after="120"/>
+              <w:jc w:val="center"/>
+            </w:pPr>
+            <w:r>
+              <w:rPr>
+                <w:b/>
+                <w:color w:val="0284C7"/>
+                <w:sz w:val="19"/>
+              </w:rPr>
+              <w:t>📸 Screenshot 3: Terminal output of SQLite database inspection showing stored AES-256-GCM encrypted messages &amp; Ed25519 signatures</w:t>
+              <w:br/>
+            </w:r>
+            <w:r>
+              <w:rPr>
+                <w:i/>
+                <w:color w:val="94A3B8"/>
+                <w:sz w:val="18"/>
+              </w:rPr>
+              <w:t>[ Paste Screenshot Here ]</w:t>
+            </w:r>
+          </w:p>
+        </w:tc>
+      </w:tr>
+    </w:tbl>
+    <w:p>
+      <w:pPr>
+        <w:spacing w:after="120"/>
+      </w:pPr>
+    </w:p>
+    <w:tbl>
+      <w:tblPr>
+        <w:tblW w:type="auto" w:w="0"/>
+        <w:jc w:val="center"/>
+        <w:tblLook w:firstColumn="1" w:firstRow="1" w:lastColumn="0" w:lastRow="0" w:noHBand="0" w:noVBand="1" w:val="04A0"/>
+      </w:tblPr>
+      <w:tblGrid>
+        <w:gridCol w:w="10512"/>
+      </w:tblGrid>
+      <w:tr>
+        <w:tc>
+          <w:tcPr>
+            <w:tcW w:type="dxa" w:w="10512"/>
+            <w:shd w:fill="F8FAFC"/>
+          </w:tcPr>
+          <w:p>
+            <w:pPr>
+              <w:spacing w:before="240" w:after="120"/>
+              <w:jc w:val="center"/>
+            </w:pPr>
+            <w:r>
+              <w:rPr>
+                <w:b/>
+                <w:color w:val="0284C7"/>
+                <w:sz w:val="19"/>
+              </w:rPr>
+              <w:t>📸 Screenshot 4: SSH Server Host Process Running (nohup python3 server.py) on student@10.1.75.51:2237</w:t>
+              <w:br/>
+            </w:r>
+            <w:r>
+              <w:rPr>
+                <w:i/>
+                <w:color w:val="94A3B8"/>
+                <w:sz w:val="18"/>
+              </w:rPr>
+              <w:t>[ Paste Screenshot Here ]</w:t>
+            </w:r>
+          </w:p>
+        </w:tc>
+      </w:tr>
+    </w:tbl>
+    <w:p>
+      <w:pPr>
+        <w:spacing w:after="120"/>
+      </w:pPr>
+    </w:p>
+    <w:p/>
+    <w:p>
+      <w:r>
+        <w:rPr>
+          <w:b/>
+          <w:color w:val="1E1B4B"/>
+          <w:sz w:val="26"/>
+        </w:rPr>
+        <w:t>5. Database Verification Commands (SSH Host)</w:t>
       </w:r>
     </w:p>
     <w:p>
@@ -1069,7 +1351,7 @@
           <w:color w:val="1E1B4B"/>
           <w:sz w:val="26"/>
         </w:rPr>
-        <w:t>5. Official Submission Links</w:t>
+        <w:t>6. Official Submission Links</w:t>
       </w:r>
     </w:p>
     <w:p>

</xml_diff>

<commit_message>
Add persistence, tamper detection, and signature verification demonstration screenshot placeholders and demo_tamper.py helper
</commit_message>
<xml_diff>
--- a/Group_Chat_Architecture_Report.docx
+++ b/Group_Chat_Architecture_Report.docx
@@ -20,7 +20,7 @@
           <w:color w:val="4F46E5"/>
           <w:sz w:val="22"/>
         </w:rPr>
-        <w:t>Computer System Design (CSD) — Assignment 4 | Comprehensive Technical &amp; Team Contribution Report</w:t>
+        <w:t>Computer System Design (CSD) — Assignment 4 | Persistence, Security &amp; Verification Report</w:t>
       </w:r>
     </w:p>
     <w:p/>
@@ -606,87 +606,235 @@
       <w:r>
         <w:rPr>
           <w:b/>
-          <w:color w:val="4F46E5"/>
-          <w:sz w:val="22"/>
+          <w:color w:val="1E1B4B"/>
+          <w:sz w:val="26"/>
         </w:rPr>
-        <w:t>Detailed Task Breakdown:</w:t>
+        <w:t>3. Demonstrations: Persistence, Tamper Detection &amp; Signatures</w:t>
       </w:r>
     </w:p>
+    <w:tbl>
+      <w:tblPr>
+        <w:tblW w:type="auto" w:w="0"/>
+        <w:jc w:val="center"/>
+        <w:tblLook w:firstColumn="1" w:firstRow="1" w:lastColumn="0" w:lastRow="0" w:noHBand="0" w:noVBand="1" w:val="04A0"/>
+      </w:tblPr>
+      <w:tblGrid>
+        <w:gridCol w:w="10512"/>
+      </w:tblGrid>
+      <w:tr>
+        <w:tc>
+          <w:tcPr>
+            <w:tcW w:type="dxa" w:w="10512"/>
+            <w:shd w:fill="F8FAFC"/>
+          </w:tcPr>
+          <w:p>
+            <w:pPr>
+              <w:spacing w:before="200" w:after="120"/>
+              <w:jc w:val="center"/>
+            </w:pPr>
+            <w:r>
+              <w:rPr>
+                <w:b/>
+                <w:color w:val="0284C7"/>
+                <w:sz w:val="20"/>
+              </w:rPr>
+              <w:t>📸 Screenshot 1: Real-Time Multi-User Chat UI Demonstration</w:t>
+              <w:br/>
+            </w:r>
+            <w:r>
+              <w:rPr>
+                <w:color w:val="475569"/>
+                <w:sz w:val="17"/>
+              </w:rPr>
+              <w:t>Demonstrates active chat on http://10.1.75.51:5237/ with multiple client connections, dynamic gradient avatars, and live typing status.</w:t>
+              <w:br/>
+              <w:br/>
+            </w:r>
+            <w:r>
+              <w:rPr>
+                <w:b/>
+                <w:i/>
+                <w:color w:val="94A3B8"/>
+                <w:sz w:val="18"/>
+              </w:rPr>
+              <w:t>[ Paste Screenshot Here ]</w:t>
+            </w:r>
+          </w:p>
+        </w:tc>
+      </w:tr>
+    </w:tbl>
     <w:p>
       <w:pPr>
-        <w:pStyle w:val="ListBullet"/>
-        <w:spacing w:after="60"/>
+        <w:spacing w:after="80"/>
       </w:pPr>
-      <w:r>
-        <w:rPr>
-          <w:b/>
-          <w:sz w:val="18"/>
-        </w:rPr>
-        <w:t xml:space="preserve">Ranga Chandra Naga Venkata Chaitanya Kumar (12341740): </w:t>
-      </w:r>
-      <w:r>
-        <w:rPr>
-          <w:sz w:val="18"/>
-        </w:rPr>
-        <w:t>Designed the core Flask-SocketIO architecture, implemented server-side room management, integrated AES-256-GCM symmetric encryption and per-user Ed25519 digital signature signing/verification, and managed SSH server deployment on student@10.1.75.51:2237.</w:t>
-      </w:r>
     </w:p>
+    <w:tbl>
+      <w:tblPr>
+        <w:tblW w:type="auto" w:w="0"/>
+        <w:jc w:val="center"/>
+        <w:tblLook w:firstColumn="1" w:firstRow="1" w:lastColumn="0" w:lastRow="0" w:noHBand="0" w:noVBand="1" w:val="04A0"/>
+      </w:tblPr>
+      <w:tblGrid>
+        <w:gridCol w:w="10512"/>
+      </w:tblGrid>
+      <w:tr>
+        <w:tc>
+          <w:tcPr>
+            <w:tcW w:type="dxa" w:w="10512"/>
+            <w:shd w:fill="F8FAFC"/>
+          </w:tcPr>
+          <w:p>
+            <w:pPr>
+              <w:spacing w:before="200" w:after="120"/>
+              <w:jc w:val="center"/>
+            </w:pPr>
+            <w:r>
+              <w:rPr>
+                <w:b/>
+                <w:color w:val="0284C7"/>
+                <w:sz w:val="20"/>
+              </w:rPr>
+              <w:t>📸 Screenshot 2: Demonstration of Message Persistence (Server Restart)</w:t>
+              <w:br/>
+            </w:r>
+            <w:r>
+              <w:rPr>
+                <w:color w:val="475569"/>
+                <w:sz w:val="17"/>
+              </w:rPr>
+              <w:t>Demonstrates persistence: The python3 server.py process was terminated and restarted. Upon client reconnection, all historical messages were automatically loaded from SQLite (chat.db).</w:t>
+              <w:br/>
+              <w:br/>
+            </w:r>
+            <w:r>
+              <w:rPr>
+                <w:b/>
+                <w:i/>
+                <w:color w:val="94A3B8"/>
+                <w:sz w:val="18"/>
+              </w:rPr>
+              <w:t>[ Paste Screenshot Here ]</w:t>
+            </w:r>
+          </w:p>
+        </w:tc>
+      </w:tr>
+    </w:tbl>
     <w:p>
       <w:pPr>
-        <w:pStyle w:val="ListBullet"/>
-        <w:spacing w:after="60"/>
+        <w:spacing w:after="80"/>
       </w:pPr>
-      <w:r>
-        <w:rPr>
-          <w:b/>
-          <w:sz w:val="18"/>
-        </w:rPr>
-        <w:t xml:space="preserve">Bhukya Raju (12340520): </w:t>
-      </w:r>
-      <w:r>
-        <w:rPr>
-          <w:sz w:val="18"/>
-        </w:rPr>
-        <w:t>Developed the single-page responsive UI using HTML5, CSS3, and JavaScript, designed the Cyberpunk Aurora dark-mode glassmorphic theme with glowing ambient mesh blobs, and created dynamic user avatar color generators.</w:t>
-      </w:r>
     </w:p>
+    <w:tbl>
+      <w:tblPr>
+        <w:tblW w:type="auto" w:w="0"/>
+        <w:jc w:val="center"/>
+        <w:tblLook w:firstColumn="1" w:firstRow="1" w:lastColumn="0" w:lastRow="0" w:noHBand="0" w:noVBand="1" w:val="04A0"/>
+      </w:tblPr>
+      <w:tblGrid>
+        <w:gridCol w:w="10512"/>
+      </w:tblGrid>
+      <w:tr>
+        <w:tc>
+          <w:tcPr>
+            <w:tcW w:type="dxa" w:w="10512"/>
+            <w:shd w:fill="F8FAFC"/>
+          </w:tcPr>
+          <w:p>
+            <w:pPr>
+              <w:spacing w:before="200" w:after="120"/>
+              <w:jc w:val="center"/>
+            </w:pPr>
+            <w:r>
+              <w:rPr>
+                <w:b/>
+                <w:color w:val="0284C7"/>
+                <w:sz w:val="20"/>
+              </w:rPr>
+              <w:t>📸 Screenshot 3: Demonstration of Tamper Detection (AES-256-GCM Auth Tag Failure)</w:t>
+              <w:br/>
+            </w:r>
+            <w:r>
+              <w:rPr>
+                <w:color w:val="475569"/>
+                <w:sz w:val="17"/>
+              </w:rPr>
+              <w:t>Demonstrates Tamper Detection: After corrupting 1 byte of stored ciphertext in chat.db using demo_tamper.py, AES-256-GCM authentication tag verification failed, displaying [TAMPER DETECTED: ciphertext/authentication tag invalid].</w:t>
+              <w:br/>
+              <w:br/>
+            </w:r>
+            <w:r>
+              <w:rPr>
+                <w:b/>
+                <w:i/>
+                <w:color w:val="94A3B8"/>
+                <w:sz w:val="18"/>
+              </w:rPr>
+              <w:t>[ Paste Screenshot Here ]</w:t>
+            </w:r>
+          </w:p>
+        </w:tc>
+      </w:tr>
+    </w:tbl>
     <w:p>
       <w:pPr>
-        <w:pStyle w:val="ListBullet"/>
-        <w:spacing w:after="60"/>
+        <w:spacing w:after="80"/>
       </w:pPr>
-      <w:r>
-        <w:rPr>
-          <w:b/>
-          <w:sz w:val="18"/>
-        </w:rPr>
-        <w:t xml:space="preserve">V.G.N. Harshitha (12342310): </w:t>
-      </w:r>
-      <w:r>
-        <w:rPr>
-          <w:sz w:val="18"/>
-        </w:rPr>
-        <w:t>Architected the SQLite database layer (chat.db) with tables for messages and user public keys, implemented message history pre-loading on user join, and ensured data integrity during server restarts.</w:t>
-      </w:r>
     </w:p>
+    <w:tbl>
+      <w:tblPr>
+        <w:tblW w:type="auto" w:w="0"/>
+        <w:jc w:val="center"/>
+        <w:tblLook w:firstColumn="1" w:firstRow="1" w:lastColumn="0" w:lastRow="0" w:noHBand="0" w:noVBand="1" w:val="04A0"/>
+      </w:tblPr>
+      <w:tblGrid>
+        <w:gridCol w:w="10512"/>
+      </w:tblGrid>
+      <w:tr>
+        <w:tc>
+          <w:tcPr>
+            <w:tcW w:type="dxa" w:w="10512"/>
+            <w:shd w:fill="F8FAFC"/>
+          </w:tcPr>
+          <w:p>
+            <w:pPr>
+              <w:spacing w:before="200" w:after="120"/>
+              <w:jc w:val="center"/>
+            </w:pPr>
+            <w:r>
+              <w:rPr>
+                <w:b/>
+                <w:color w:val="0284C7"/>
+                <w:sz w:val="20"/>
+              </w:rPr>
+              <w:t>📸 Screenshot 4: Demonstration of Signature Verification (Ed25519)</w:t>
+              <w:br/>
+            </w:r>
+            <w:r>
+              <w:rPr>
+                <w:color w:val="475569"/>
+                <w:sz w:val="17"/>
+              </w:rPr>
+              <w:t>Demonstrates Digital Signatures: Terminal output of sqlite3 ~/chat_app/chat.db showing per-user Ed25519 public keys in signing_keys table and raw cryptographic signatures in messages table.</w:t>
+              <w:br/>
+              <w:br/>
+            </w:r>
+            <w:r>
+              <w:rPr>
+                <w:b/>
+                <w:i/>
+                <w:color w:val="94A3B8"/>
+                <w:sz w:val="18"/>
+              </w:rPr>
+              <w:t>[ Paste Screenshot Here ]</w:t>
+            </w:r>
+          </w:p>
+        </w:tc>
+      </w:tr>
+    </w:tbl>
     <w:p>
       <w:pPr>
-        <w:pStyle w:val="ListBullet"/>
-        <w:spacing w:after="60"/>
+        <w:spacing w:after="80"/>
       </w:pPr>
-      <w:r>
-        <w:rPr>
-          <w:b/>
-          <w:sz w:val="18"/>
-        </w:rPr>
-        <w:t xml:space="preserve">Maloth Madhu (12341370): </w:t>
-      </w:r>
-      <w:r>
-        <w:rPr>
-          <w:sz w:val="18"/>
-        </w:rPr>
-        <w:t>Executed end-to-end integration testing across 4 lab client SSH machines, verified port forwarding (5000 -&gt; 5237), implemented edge-case socket disconnection handling, and documented SQLite database inspection queries.</w:t>
-      </w:r>
     </w:p>
     <w:p/>
     <w:p>
@@ -696,7 +844,7 @@
           <w:color w:val="1E1B4B"/>
           <w:sz w:val="26"/>
         </w:rPr>
-        <w:t>3. Core Features &amp; Requirement Verification</w:t>
+        <w:t>4. Core Features &amp; Requirement Verification Matrix</w:t>
       </w:r>
     </w:p>
     <w:tbl>
@@ -795,7 +943,7 @@
             <w:r>
               <w:rPr>
                 <w:b/>
-                <w:color w:val="16A3A4"/>
+                <w:color w:val="16A34A"/>
                 <w:sz w:val="17"/>
               </w:rPr>
               <w:t>VERIFIED</w:t>
@@ -838,7 +986,7 @@
             <w:r>
               <w:rPr>
                 <w:b/>
-                <w:color w:val="16A3A4"/>
+                <w:color w:val="16A34A"/>
                 <w:sz w:val="17"/>
               </w:rPr>
               <w:t>VERIFIED</w:t>
@@ -881,7 +1029,7 @@
             <w:r>
               <w:rPr>
                 <w:b/>
-                <w:color w:val="16A3A4"/>
+                <w:color w:val="16A34A"/>
                 <w:sz w:val="17"/>
               </w:rPr>
               <w:t>VERIFIED</w:t>
@@ -924,7 +1072,7 @@
             <w:r>
               <w:rPr>
                 <w:b/>
-                <w:color w:val="16A3A4"/>
+                <w:color w:val="16A34A"/>
                 <w:sz w:val="17"/>
               </w:rPr>
               <w:t>VERIFIED</w:t>
@@ -942,7 +1090,7 @@
               <w:rPr>
                 <w:sz w:val="17"/>
               </w:rPr>
-              <w:t>SQLite Persistence</w:t>
+              <w:t>SQLite Message Persistence</w:t>
             </w:r>
           </w:p>
         </w:tc>
@@ -967,7 +1115,7 @@
             <w:r>
               <w:rPr>
                 <w:b/>
-                <w:color w:val="16A3A4"/>
+                <w:color w:val="16A34A"/>
                 <w:sz w:val="17"/>
               </w:rPr>
               <w:t>VERIFIED</w:t>
@@ -985,7 +1133,7 @@
               <w:rPr>
                 <w:sz w:val="17"/>
               </w:rPr>
-              <w:t>Confidentiality (AES-256-GCM)</w:t>
+              <w:t>Tamper Detection (AES-GCM)</w:t>
             </w:r>
           </w:p>
         </w:tc>
@@ -998,7 +1146,7 @@
               <w:rPr>
                 <w:sz w:val="17"/>
               </w:rPr>
-              <w:t>Payload encrypted with room key prior to database insertion</w:t>
+              <w:t>Payload encrypted with room key prior to database insertion; auth tag verified on read</w:t>
             </w:r>
           </w:p>
         </w:tc>
@@ -1010,7 +1158,7 @@
             <w:r>
               <w:rPr>
                 <w:b/>
-                <w:color w:val="16A3A4"/>
+                <w:color w:val="16A34A"/>
                 <w:sz w:val="17"/>
               </w:rPr>
               <w:t>VERIFIED</w:t>
@@ -1028,7 +1176,7 @@
               <w:rPr>
                 <w:sz w:val="17"/>
               </w:rPr>
-              <w:t>Authenticity (Ed25519)</w:t>
+              <w:t>Digital Signatures (Ed25519)</w:t>
             </w:r>
           </w:p>
         </w:tc>
@@ -1041,7 +1189,7 @@
               <w:rPr>
                 <w:sz w:val="17"/>
               </w:rPr>
-              <w:t>Cryptographic digital signature per user stored &amp; verified</w:t>
+              <w:t>Cryptographic digital signature per user stored &amp; verified against public key</w:t>
             </w:r>
           </w:p>
         </w:tc>
@@ -1053,7 +1201,7 @@
             <w:r>
               <w:rPr>
                 <w:b/>
-                <w:color w:val="16A3A4"/>
+                <w:color w:val="16A34A"/>
                 <w:sz w:val="17"/>
               </w:rPr>
               <w:t>VERIFIED</w:t>
@@ -1096,7 +1244,7 @@
             <w:r>
               <w:rPr>
                 <w:b/>
-                <w:color w:val="16A3A4"/>
+                <w:color w:val="16A34A"/>
                 <w:sz w:val="17"/>
               </w:rPr>
               <w:t>VERIFIED</w:t>
@@ -1113,202 +1261,7 @@
           <w:color w:val="1E1B4B"/>
           <w:sz w:val="26"/>
         </w:rPr>
-        <w:t>4. Application Screenshots &amp; Visual Proof</w:t>
-      </w:r>
-    </w:p>
-    <w:tbl>
-      <w:tblPr>
-        <w:tblW w:type="auto" w:w="0"/>
-        <w:jc w:val="center"/>
-        <w:tblLook w:firstColumn="1" w:firstRow="1" w:lastColumn="0" w:lastRow="0" w:noHBand="0" w:noVBand="1" w:val="04A0"/>
-      </w:tblPr>
-      <w:tblGrid>
-        <w:gridCol w:w="10512"/>
-      </w:tblGrid>
-      <w:tr>
-        <w:tc>
-          <w:tcPr>
-            <w:tcW w:type="dxa" w:w="10512"/>
-            <w:shd w:fill="F8FAFC"/>
-          </w:tcPr>
-          <w:p>
-            <w:pPr>
-              <w:spacing w:before="240" w:after="120"/>
-              <w:jc w:val="center"/>
-            </w:pPr>
-            <w:r>
-              <w:rPr>
-                <w:b/>
-                <w:color w:val="0284C7"/>
-                <w:sz w:val="19"/>
-              </w:rPr>
-              <w:t>📸 Screenshot 1: Real-Time Chat Interface on http://10.1.75.51:5237/ showing multi-user chat, dynamic avatars, and live typing indicator</w:t>
-              <w:br/>
-            </w:r>
-            <w:r>
-              <w:rPr>
-                <w:i/>
-                <w:color w:val="94A3B8"/>
-                <w:sz w:val="18"/>
-              </w:rPr>
-              <w:t>[ Paste Screenshot Here ]</w:t>
-            </w:r>
-          </w:p>
-        </w:tc>
-      </w:tr>
-    </w:tbl>
-    <w:p>
-      <w:pPr>
-        <w:spacing w:after="120"/>
-      </w:pPr>
-    </w:p>
-    <w:tbl>
-      <w:tblPr>
-        <w:tblW w:type="auto" w:w="0"/>
-        <w:jc w:val="center"/>
-        <w:tblLook w:firstColumn="1" w:firstRow="1" w:lastColumn="0" w:lastRow="0" w:noHBand="0" w:noVBand="1" w:val="04A0"/>
-      </w:tblPr>
-      <w:tblGrid>
-        <w:gridCol w:w="10512"/>
-      </w:tblGrid>
-      <w:tr>
-        <w:tc>
-          <w:tcPr>
-            <w:tcW w:type="dxa" w:w="10512"/>
-            <w:shd w:fill="F8FAFC"/>
-          </w:tcPr>
-          <w:p>
-            <w:pPr>
-              <w:spacing w:before="240" w:after="120"/>
-              <w:jc w:val="center"/>
-            </w:pPr>
-            <w:r>
-              <w:rPr>
-                <w:b/>
-                <w:color w:val="0284C7"/>
-                <w:sz w:val="19"/>
-              </w:rPr>
-              <w:t>📸 Screenshot 2: User Join Modal &amp; Unique Username Validation Screen</w:t>
-              <w:br/>
-            </w:r>
-            <w:r>
-              <w:rPr>
-                <w:i/>
-                <w:color w:val="94A3B8"/>
-                <w:sz w:val="18"/>
-              </w:rPr>
-              <w:t>[ Paste Screenshot Here ]</w:t>
-            </w:r>
-          </w:p>
-        </w:tc>
-      </w:tr>
-    </w:tbl>
-    <w:p>
-      <w:pPr>
-        <w:spacing w:after="120"/>
-      </w:pPr>
-    </w:p>
-    <w:tbl>
-      <w:tblPr>
-        <w:tblW w:type="auto" w:w="0"/>
-        <w:jc w:val="center"/>
-        <w:tblLook w:firstColumn="1" w:firstRow="1" w:lastColumn="0" w:lastRow="0" w:noHBand="0" w:noVBand="1" w:val="04A0"/>
-      </w:tblPr>
-      <w:tblGrid>
-        <w:gridCol w:w="10512"/>
-      </w:tblGrid>
-      <w:tr>
-        <w:tc>
-          <w:tcPr>
-            <w:tcW w:type="dxa" w:w="10512"/>
-            <w:shd w:fill="F8FAFC"/>
-          </w:tcPr>
-          <w:p>
-            <w:pPr>
-              <w:spacing w:before="240" w:after="120"/>
-              <w:jc w:val="center"/>
-            </w:pPr>
-            <w:r>
-              <w:rPr>
-                <w:b/>
-                <w:color w:val="0284C7"/>
-                <w:sz w:val="19"/>
-              </w:rPr>
-              <w:t>📸 Screenshot 3: Terminal output of SQLite database inspection showing stored AES-256-GCM encrypted messages &amp; Ed25519 signatures</w:t>
-              <w:br/>
-            </w:r>
-            <w:r>
-              <w:rPr>
-                <w:i/>
-                <w:color w:val="94A3B8"/>
-                <w:sz w:val="18"/>
-              </w:rPr>
-              <w:t>[ Paste Screenshot Here ]</w:t>
-            </w:r>
-          </w:p>
-        </w:tc>
-      </w:tr>
-    </w:tbl>
-    <w:p>
-      <w:pPr>
-        <w:spacing w:after="120"/>
-      </w:pPr>
-    </w:p>
-    <w:tbl>
-      <w:tblPr>
-        <w:tblW w:type="auto" w:w="0"/>
-        <w:jc w:val="center"/>
-        <w:tblLook w:firstColumn="1" w:firstRow="1" w:lastColumn="0" w:lastRow="0" w:noHBand="0" w:noVBand="1" w:val="04A0"/>
-      </w:tblPr>
-      <w:tblGrid>
-        <w:gridCol w:w="10512"/>
-      </w:tblGrid>
-      <w:tr>
-        <w:tc>
-          <w:tcPr>
-            <w:tcW w:type="dxa" w:w="10512"/>
-            <w:shd w:fill="F8FAFC"/>
-          </w:tcPr>
-          <w:p>
-            <w:pPr>
-              <w:spacing w:before="240" w:after="120"/>
-              <w:jc w:val="center"/>
-            </w:pPr>
-            <w:r>
-              <w:rPr>
-                <w:b/>
-                <w:color w:val="0284C7"/>
-                <w:sz w:val="19"/>
-              </w:rPr>
-              <w:t>📸 Screenshot 4: SSH Server Host Process Running (nohup python3 server.py) on student@10.1.75.51:2237</w:t>
-              <w:br/>
-            </w:r>
-            <w:r>
-              <w:rPr>
-                <w:i/>
-                <w:color w:val="94A3B8"/>
-                <w:sz w:val="18"/>
-              </w:rPr>
-              <w:t>[ Paste Screenshot Here ]</w:t>
-            </w:r>
-          </w:p>
-        </w:tc>
-      </w:tr>
-    </w:tbl>
-    <w:p>
-      <w:pPr>
-        <w:spacing w:after="120"/>
-      </w:pPr>
-    </w:p>
-    <w:p/>
-    <w:p>
-      <w:r>
-        <w:rPr>
-          <w:b/>
-          <w:color w:val="1E1B4B"/>
-          <w:sz w:val="26"/>
-        </w:rPr>
-        <w:t>5. Database Verification Commands (SSH Host)</w:t>
+        <w:t>5. Commands to Reproduce &amp; Verify Tests on SSH Server</w:t>
       </w:r>
     </w:p>
     <w:p>
@@ -1316,7 +1269,7 @@
         <w:rPr>
           <w:sz w:val="18"/>
         </w:rPr>
-        <w:t>To inspect encrypted messages and signatures in SQLite:</w:t>
+        <w:t>1. To inspect stored encrypted messages &amp; Ed25519 signatures:</w:t>
         <w:br/>
       </w:r>
       <w:r>
@@ -1332,7 +1285,7 @@
         <w:rPr>
           <w:sz w:val="18"/>
         </w:rPr>
-        <w:t>To verify public Ed25519 user signing keys:</w:t>
+        <w:t>2. To verify user Ed25519 public keys:</w:t>
         <w:br/>
       </w:r>
       <w:r>
@@ -1341,6 +1294,22 @@
           <w:sz w:val="17"/>
         </w:rPr>
         <w:t>sqlite3 ~/chat_app/chat.db "SELECT username, public_key FROM signing_keys;"</w:t>
+        <w:br/>
+        <w:br/>
+      </w:r>
+      <w:r>
+        <w:rPr>
+          <w:sz w:val="18"/>
+        </w:rPr>
+        <w:t>3. To trigger Tamper Detection for Screenshot 3:</w:t>
+        <w:br/>
+      </w:r>
+      <w:r>
+        <w:rPr>
+          <w:rFonts w:ascii="Consolas" w:hAnsi="Consolas"/>
+          <w:sz w:val="17"/>
+        </w:rPr>
+        <w:t>python3 ~/chat_app/demo_tamper.py</w:t>
       </w:r>
     </w:p>
     <w:p/>

</xml_diff>